<commit_message>
Complete design overhaul and rebranding to ShopEEZZ: emerald green/amber styling, circular scroll categories, double-row navbar, full-width cart buttons, randomized seed pricing, and updated Word document infodoc.docx
</commit_message>
<xml_diff>
--- a/infodoc.docx
+++ b/infodoc.docx
@@ -32,16 +32,16 @@
       </w:pPr>
       <w:r>
         <w:rPr/>
-        <w:t xml:space="preserve">ShopEZ — Project Architecture &amp; Documentation</w:t>
-      </w:r>
-    </w:p>
-    <w:p>
-      <w:pPr>
-        <w:spacing w:lineRule="auto"/>
-      </w:pPr>
-      <w:r>
-        <w:rPr/>
-        <w:t xml:space="preserve">ShopEZ is a modern, full-stack e-commerce application designed with a clean separation of concerns using the </w:t>
+        <w:t xml:space="preserve">ShopEEZZ — Project Architecture &amp; Documentation</w:t>
+      </w:r>
+    </w:p>
+    <w:p>
+      <w:pPr>
+        <w:spacing w:lineRule="auto"/>
+      </w:pPr>
+      <w:r>
+        <w:rPr/>
+        <w:t xml:space="preserve">ShopEEZZ is a modern, full-stack e-commerce application designed with a clean separation of concerns using the </w:t>
       </w:r>
       <w:r>
         <w:rPr>
@@ -567,15 +567,7 @@
       </w:pPr>
       <w:r>
         <w:rPr/>
-        <w:t xml:space="preserve">Features a custom vector design representing a shopping bag outline merged with a stylized Indian Rupee (</w:t>
-      </w:r>
-      <w:r>
-        <w:rPr/>
-        <w:t xml:space="preserve">₹</w:t>
-      </w:r>
-      <w:r>
-        <w:rPr/>
-        <w:t xml:space="preserve">) symbol.</w:t>
+        <w:t xml:space="preserve">Features a custom vector design representing a fast shopping trolley emblem.</w:t>
       </w:r>
     </w:p>
     <w:p>
@@ -588,7 +580,7 @@
       </w:pPr>
       <w:r>
         <w:rPr/>
-        <w:t xml:space="preserve">Accented with a modern Indian tricolor gradient (saffron-white-emerald) on the bag handle and dynamic gold-to-emerald gradient lettering on the logo brand name text.</w:t>
+        <w:t xml:space="preserve">Styled with a premium emerald green-to-teal gradient background, and highlighted with bright gold-amber accents.</w:t>
       </w:r>
     </w:p>
     <w:p>
@@ -601,11 +593,116 @@
       </w:pPr>
       <w:r>
         <w:rPr/>
+        <w:t xml:space="preserve">Logo typography matches the new identity: </w:t>
+      </w:r>
+      <w:r>
+        <w:rPr/>
+        <w:t xml:space="preserve">Shop</w:t>
+      </w:r>
+      <w:r>
+        <w:rPr/>
+        <w:t xml:space="preserve"> (black/dark-gray, extra bold) and </w:t>
+      </w:r>
+      <w:r>
+        <w:rPr/>
+        <w:t xml:space="preserve">EEZZ</w:t>
+      </w:r>
+      <w:r>
+        <w:rPr/>
+        <w:t xml:space="preserve"> (styled in a green-to-amber text gradient).</w:t>
+      </w:r>
+    </w:p>
+    <w:p>
+      <w:pPr>
+        <w:numPr>
+          <w:ilvl w:val="1"/>
+          <w:numId w:val="8"/>
+        </w:numPr>
+        <w:spacing w:lineRule="auto"/>
+      </w:pPr>
+      <w:r>
+        <w:rPr/>
         <w:t xml:space="preserve">Implemented across the navigation header, footer, login page, and sign-up screens for brand uniformity.</w:t>
       </w:r>
     </w:p>
     <w:p>
       <w:pPr>
+        <w:numPr>
+          <w:ilvl w:val="0"/>
+          <w:numId w:val="7"/>
+        </w:numPr>
+        <w:spacing w:lineRule="auto"/>
+      </w:pPr>
+      <w:r>
+        <w:rPr>
+          <w:b/>
+        </w:rPr>
+        <w:t xml:space="preserve">UI Restructuring and Layout Shifts</w:t>
+      </w:r>
+      <w:r>
+        <w:rPr/>
+        <w:t xml:space="preserve">:</w:t>
+      </w:r>
+    </w:p>
+    <w:p>
+      <w:pPr>
+        <w:numPr>
+          <w:ilvl w:val="1"/>
+          <w:numId w:val="9"/>
+        </w:numPr>
+        <w:spacing w:lineRule="auto"/>
+      </w:pPr>
+      <w:r>
+        <w:rPr>
+          <w:b/>
+        </w:rPr>
+        <w:t xml:space="preserve">Double-Row Header/Navbar</w:t>
+      </w:r>
+      <w:r>
+        <w:rPr/>
+        <w:t xml:space="preserve">: Features a dark-emerald top mini-bar providing direct customer support information and local shipping benefits, with a clean bottom bar for brand identity, navigation links, and floating cart controls.</w:t>
+      </w:r>
+    </w:p>
+    <w:p>
+      <w:pPr>
+        <w:numPr>
+          <w:ilvl w:val="1"/>
+          <w:numId w:val="9"/>
+        </w:numPr>
+        <w:spacing w:lineRule="auto"/>
+      </w:pPr>
+      <w:r>
+        <w:rPr>
+          <w:b/>
+        </w:rPr>
+        <w:t xml:space="preserve">Circular Categories list</w:t>
+      </w:r>
+      <w:r>
+        <w:rPr/>
+        <w:t xml:space="preserve">: Category navigation on the Homepage has been redesigned from a blocky rectangular grid to a horizontal scrollable strip of circular, border-highlighted badges.</w:t>
+      </w:r>
+    </w:p>
+    <w:p>
+      <w:pPr>
+        <w:numPr>
+          <w:ilvl w:val="1"/>
+          <w:numId w:val="9"/>
+        </w:numPr>
+        <w:spacing w:lineRule="auto"/>
+      </w:pPr>
+      <w:r>
+        <w:rPr>
+          <w:b/>
+        </w:rPr>
+        <w:t xml:space="preserve">Product Card Redesign</w:t>
+      </w:r>
+      <w:r>
+        <w:rPr/>
+        <w:t xml:space="preserve">: Cards are framed with a thin gray border that highlights emerald green on hover. Cart submission uses a full-width bottom button instead of a small bottom-right icon, giving the grids a completely different geometric distribution.</w:t>
+      </w:r>
+    </w:p>
+    <w:p>
+      <w:pPr>
         <w:pStyle w:val="Heading2"/>
         <w:spacing w:lineRule="auto"/>
       </w:pPr>
@@ -622,116 +719,6 @@
       <w:r>
         <w:rPr/>
         <w:t xml:space="preserve">👤 Authentication</w:t>
-      </w:r>
-    </w:p>
-    <w:p>
-      <w:pPr>
-        <w:numPr>
-          <w:ilvl w:val="0"/>
-          <w:numId w:val="9"/>
-        </w:numPr>
-        <w:spacing w:lineRule="auto"/>
-      </w:pPr>
-      <w:r>
-        <w:rPr/>
-        <w:t xml:space="preserve">Users register with fullName, email, password, and phone number.</w:t>
-      </w:r>
-    </w:p>
-    <w:p>
-      <w:pPr>
-        <w:numPr>
-          <w:ilvl w:val="0"/>
-          <w:numId w:val="9"/>
-        </w:numPr>
-        <w:spacing w:lineRule="auto"/>
-      </w:pPr>
-      <w:r>
-        <w:rPr/>
-        <w:t xml:space="preserve">Passwords are encrypted using </w:t>
-      </w:r>
-      <w:r>
-        <w:rPr/>
-        <w:t xml:space="preserve">bcryptjs</w:t>
-      </w:r>
-      <w:r>
-        <w:rPr/>
-        <w:t xml:space="preserve">.</w:t>
-      </w:r>
-    </w:p>
-    <w:p>
-      <w:pPr>
-        <w:numPr>
-          <w:ilvl w:val="0"/>
-          <w:numId w:val="9"/>
-        </w:numPr>
-        <w:spacing w:lineRule="auto"/>
-      </w:pPr>
-      <w:r>
-        <w:rPr/>
-        <w:t xml:space="preserve">Successful logins return a signed JWT token, which is stored in the browser's </w:t>
-      </w:r>
-      <w:r>
-        <w:rPr/>
-        <w:t xml:space="preserve">localStorage</w:t>
-      </w:r>
-      <w:r>
-        <w:rPr/>
-        <w:t xml:space="preserve"> and attached as a </w:t>
-      </w:r>
-      <w:r>
-        <w:rPr/>
-        <w:t xml:space="preserve">Bearer</w:t>
-      </w:r>
-      <w:r>
-        <w:rPr/>
-        <w:t xml:space="preserve"> token header in consecutive REST requests.</w:t>
-      </w:r>
-    </w:p>
-    <w:p>
-      <w:pPr>
-        <w:numPr>
-          <w:ilvl w:val="0"/>
-          <w:numId w:val="9"/>
-        </w:numPr>
-        <w:spacing w:lineRule="auto"/>
-      </w:pPr>
-      <w:r>
-        <w:rPr/>
-        <w:t xml:space="preserve">Admins possess </w:t>
-      </w:r>
-      <w:r>
-        <w:rPr/>
-        <w:t xml:space="preserve">role: 'admin'</w:t>
-      </w:r>
-      <w:r>
-        <w:rPr/>
-        <w:t xml:space="preserve">, granting them access to secure </w:t>
-      </w:r>
-      <w:r>
-        <w:rPr/>
-        <w:t xml:space="preserve">/admin</w:t>
-      </w:r>
-      <w:r>
-        <w:rPr/>
-        <w:t xml:space="preserve"> layouts on the frontend and REST routes protected by the </w:t>
-      </w:r>
-      <w:r>
-        <w:rPr/>
-        <w:t xml:space="preserve">adminOnly</w:t>
-      </w:r>
-      <w:r>
-        <w:rPr/>
-        <w:t xml:space="preserve"> middleware on the server.</w:t>
-      </w:r>
-    </w:p>
-    <w:p>
-      <w:pPr>
-        <w:pStyle w:val="Heading3"/>
-        <w:spacing w:lineRule="auto"/>
-      </w:pPr>
-      <w:r>
-        <w:rPr/>
-        <w:t xml:space="preserve">🛒 Cart &amp; Checkout</w:t>
       </w:r>
     </w:p>
     <w:p>
@@ -744,7 +731,7 @@
       </w:pPr>
       <w:r>
         <w:rPr/>
-        <w:t xml:space="preserve">Cart items are stored directly in MongoDB, persisting across different devices and logins.</w:t>
+        <w:t xml:space="preserve">Users register with fullName, email, password, and phone number.</w:t>
       </w:r>
     </w:p>
     <w:p>
@@ -757,7 +744,15 @@
       </w:pPr>
       <w:r>
         <w:rPr/>
-        <w:t xml:space="preserve">Placing an order validates that items are in stock, creates an Order record, decrements the product stock levels accordingly, and clears the user's cart in a single transaction-safe manner.</w:t>
+        <w:t xml:space="preserve">Passwords are encrypted using </w:t>
+      </w:r>
+      <w:r>
+        <w:rPr/>
+        <w:t xml:space="preserve">bcryptjs</w:t>
+      </w:r>
+      <w:r>
+        <w:rPr/>
+        <w:t xml:space="preserve">.</w:t>
       </w:r>
     </w:p>
     <w:p>
@@ -770,7 +765,68 @@
       </w:pPr>
       <w:r>
         <w:rPr/>
-        <w:t xml:space="preserve">Standard order placement operates on Cash on Delivery (COD).</w:t>
+        <w:t xml:space="preserve">Successful logins return a signed JWT token, which is stored in the browser's </w:t>
+      </w:r>
+      <w:r>
+        <w:rPr/>
+        <w:t xml:space="preserve">localStorage</w:t>
+      </w:r>
+      <w:r>
+        <w:rPr/>
+        <w:t xml:space="preserve"> (key: </w:t>
+      </w:r>
+      <w:r>
+        <w:rPr/>
+        <w:t xml:space="preserve">shopeezz_token</w:t>
+      </w:r>
+      <w:r>
+        <w:rPr/>
+        <w:t xml:space="preserve">) and attached as a </w:t>
+      </w:r>
+      <w:r>
+        <w:rPr/>
+        <w:t xml:space="preserve">Bearer</w:t>
+      </w:r>
+      <w:r>
+        <w:rPr/>
+        <w:t xml:space="preserve"> token header in consecutive REST requests.</w:t>
+      </w:r>
+    </w:p>
+    <w:p>
+      <w:pPr>
+        <w:numPr>
+          <w:ilvl w:val="0"/>
+          <w:numId w:val="10"/>
+        </w:numPr>
+        <w:spacing w:lineRule="auto"/>
+      </w:pPr>
+      <w:r>
+        <w:rPr/>
+        <w:t xml:space="preserve">Admins possess </w:t>
+      </w:r>
+      <w:r>
+        <w:rPr/>
+        <w:t xml:space="preserve">role: 'admin'</w:t>
+      </w:r>
+      <w:r>
+        <w:rPr/>
+        <w:t xml:space="preserve">, granting them access to secure </w:t>
+      </w:r>
+      <w:r>
+        <w:rPr/>
+        <w:t xml:space="preserve">/admin</w:t>
+      </w:r>
+      <w:r>
+        <w:rPr/>
+        <w:t xml:space="preserve"> layouts on the frontend and REST routes protected by the </w:t>
+      </w:r>
+      <w:r>
+        <w:rPr/>
+        <w:t xml:space="preserve">adminOnly</w:t>
+      </w:r>
+      <w:r>
+        <w:rPr/>
+        <w:t xml:space="preserve"> middleware on the server.</w:t>
       </w:r>
     </w:p>
     <w:p>
@@ -780,7 +836,7 @@
       </w:pPr>
       <w:r>
         <w:rPr/>
-        <w:t xml:space="preserve">📊 Admin Panel</w:t>
+        <w:t xml:space="preserve">🛒 Cart &amp; Checkout</w:t>
       </w:r>
     </w:p>
     <w:p>
@@ -788,6 +844,55 @@
         <w:numPr>
           <w:ilvl w:val="0"/>
           <w:numId w:val="11"/>
+        </w:numPr>
+        <w:spacing w:lineRule="auto"/>
+      </w:pPr>
+      <w:r>
+        <w:rPr/>
+        <w:t xml:space="preserve">Cart items are stored directly in MongoDB, persisting across different devices and logins.</w:t>
+      </w:r>
+    </w:p>
+    <w:p>
+      <w:pPr>
+        <w:numPr>
+          <w:ilvl w:val="0"/>
+          <w:numId w:val="11"/>
+        </w:numPr>
+        <w:spacing w:lineRule="auto"/>
+      </w:pPr>
+      <w:r>
+        <w:rPr/>
+        <w:t xml:space="preserve">Placing an order validates that items are in stock, creates an Order record, decrements the product stock levels accordingly, and clears the user's cart in a single transaction-safe manner.</w:t>
+      </w:r>
+    </w:p>
+    <w:p>
+      <w:pPr>
+        <w:numPr>
+          <w:ilvl w:val="0"/>
+          <w:numId w:val="11"/>
+        </w:numPr>
+        <w:spacing w:lineRule="auto"/>
+      </w:pPr>
+      <w:r>
+        <w:rPr/>
+        <w:t xml:space="preserve">Standard order placement operates on Cash on Delivery (COD).</w:t>
+      </w:r>
+    </w:p>
+    <w:p>
+      <w:pPr>
+        <w:pStyle w:val="Heading3"/>
+        <w:spacing w:lineRule="auto"/>
+      </w:pPr>
+      <w:r>
+        <w:rPr/>
+        <w:t xml:space="preserve">📊 Admin Panel</w:t>
+      </w:r>
+    </w:p>
+    <w:p>
+      <w:pPr>
+        <w:numPr>
+          <w:ilvl w:val="0"/>
+          <w:numId w:val="12"/>
         </w:numPr>
         <w:spacing w:lineRule="auto"/>
       </w:pPr>
@@ -806,7 +911,7 @@
       <w:pPr>
         <w:numPr>
           <w:ilvl w:val="0"/>
-          <w:numId w:val="11"/>
+          <w:numId w:val="12"/>
         </w:numPr>
         <w:spacing w:lineRule="auto"/>
       </w:pPr>
@@ -825,7 +930,7 @@
       <w:pPr>
         <w:numPr>
           <w:ilvl w:val="0"/>
-          <w:numId w:val="11"/>
+          <w:numId w:val="12"/>
         </w:numPr>
         <w:spacing w:lineRule="auto"/>
       </w:pPr>
@@ -2186,6 +2291,128 @@
     </w:lvl>
   </w:abstractNum>
   <w:abstractNum w:abstractNumId="11">
+    <w:lvl w:ilvl="0">
+      <w:start w:val="1"/>
+      <w:numFmt w:val="bullet"/>
+      <w:lvlText w:val=""/>
+      <w:lvlJc w:val="left"/>
+      <w:pPr>
+        <w:tabs>
+          <w:tab w:val="num" w:pos="720"/>
+        </w:tabs>
+        <w:ind w:left="720" w:hanging="360"/>
+      </w:pPr>
+      <w:rPr>
+        <w:rFonts w:ascii="Symbol" w:hAnsi="Symbol" w:hint="default"/>
+      </w:rPr>
+    </w:lvl>
+    <w:lvl w:ilvl="1">
+      <w:start w:val="1"/>
+      <w:numFmt w:val="bullet"/>
+      <w:lvlText w:val=""/>
+      <w:lvlJc w:val="left"/>
+      <w:pPr>
+        <w:tabs>
+          <w:tab w:val="num" w:pos="1440"/>
+        </w:tabs>
+        <w:ind w:left="1440" w:hanging="360"/>
+      </w:pPr>
+      <w:rPr>
+        <w:rFonts w:ascii="Symbol" w:hAnsi="Symbol" w:hint="default"/>
+      </w:rPr>
+    </w:lvl>
+    <w:lvl w:ilvl="2">
+      <w:start w:val="1"/>
+      <w:numFmt w:val="bullet"/>
+      <w:lvlText w:val=""/>
+      <w:lvlJc w:val="left"/>
+      <w:pPr>
+        <w:tabs>
+          <w:tab w:val="num" w:pos="2160"/>
+        </w:tabs>
+        <w:ind w:left="2160" w:hanging="360"/>
+      </w:pPr>
+      <w:rPr>
+        <w:rFonts w:ascii="Symbol" w:hAnsi="Symbol" w:hint="default"/>
+      </w:rPr>
+    </w:lvl>
+    <w:lvl w:ilvl="3">
+      <w:start w:val="1"/>
+      <w:numFmt w:val="bullet"/>
+      <w:lvlText w:val=""/>
+      <w:lvlJc w:val="left"/>
+      <w:pPr>
+        <w:tabs>
+          <w:tab w:val="num" w:pos="2880"/>
+        </w:tabs>
+        <w:ind w:left="2880" w:hanging="360"/>
+      </w:pPr>
+      <w:rPr>
+        <w:rFonts w:ascii="Symbol" w:hAnsi="Symbol" w:hint="default"/>
+      </w:rPr>
+    </w:lvl>
+    <w:lvl w:ilvl="4">
+      <w:start w:val="1"/>
+      <w:numFmt w:val="bullet"/>
+      <w:lvlText w:val=""/>
+      <w:lvlJc w:val="left"/>
+      <w:pPr>
+        <w:tabs>
+          <w:tab w:val="num" w:pos="3600"/>
+        </w:tabs>
+        <w:ind w:left="3600" w:hanging="360"/>
+      </w:pPr>
+      <w:rPr>
+        <w:rFonts w:ascii="Symbol" w:hAnsi="Symbol" w:hint="default"/>
+      </w:rPr>
+    </w:lvl>
+    <w:lvl w:ilvl="5">
+      <w:start w:val="1"/>
+      <w:numFmt w:val="bullet"/>
+      <w:lvlText w:val=""/>
+      <w:lvlJc w:val="left"/>
+      <w:pPr>
+        <w:tabs>
+          <w:tab w:val="num" w:pos="4320"/>
+        </w:tabs>
+        <w:ind w:left="4320" w:hanging="360"/>
+      </w:pPr>
+      <w:rPr>
+        <w:rFonts w:ascii="Symbol" w:hAnsi="Symbol" w:hint="default"/>
+      </w:rPr>
+    </w:lvl>
+    <w:lvl w:ilvl="6">
+      <w:start w:val="1"/>
+      <w:numFmt w:val="bullet"/>
+      <w:lvlText w:val=""/>
+      <w:lvlJc w:val="left"/>
+      <w:pPr>
+        <w:tabs>
+          <w:tab w:val="num" w:pos="5040"/>
+        </w:tabs>
+        <w:ind w:left="5040" w:hanging="360"/>
+      </w:pPr>
+      <w:rPr>
+        <w:rFonts w:ascii="Symbol" w:hAnsi="Symbol" w:hint="default"/>
+      </w:rPr>
+    </w:lvl>
+    <w:lvl w:ilvl="7">
+      <w:start w:val="1"/>
+      <w:numFmt w:val="bullet"/>
+      <w:lvlText w:val=""/>
+      <w:lvlJc w:val="left"/>
+      <w:pPr>
+        <w:tabs>
+          <w:tab w:val="num" w:pos="5760"/>
+        </w:tabs>
+        <w:ind w:left="5760" w:hanging="360"/>
+      </w:pPr>
+      <w:rPr>
+        <w:rFonts w:ascii="Symbol" w:hAnsi="Symbol" w:hint="default"/>
+      </w:rPr>
+    </w:lvl>
+  </w:abstractNum>
+  <w:abstractNum w:abstractNumId="12">
     <w:lvl w:ilvl="0">
       <w:start w:val="1"/>
       <w:numFmt w:val="bullet"/>
@@ -2339,6 +2566,9 @@
   </w:num>
   <w:num w:numId="11">
     <w:abstractNumId w:val="11"/>
+  </w:num>
+  <w:num w:numId="12">
+    <w:abstractNumId w:val="12"/>
   </w:num>
 </w:numbering>
 </file>

</xml_diff>